<commit_message>
Corregge stazione bilanciere per un solo castello e chiarisce la scansione oraria
La stazione 1 ora divide le 4 ragazze in 2+2: metà al castello per lo
squat, metà a terra per lo stacco, con scambio a metà stazione. Aggiunge
una tabella con la scansione minuto per minuto del blocco da 30'.

Co-Authored-By: Claude Sonnet 5 <noreply@anthropic.com>
Claude-Session: https://claude.ai/code/session_01A8B3XEGiQEzbQL2hnkViua
</commit_message>
<xml_diff>
--- a/serie-d/Serie D - Forza a stazioni - 30 minuti.docx
+++ b/serie-d/Serie D - Forza a stazioni - 30 minuti.docx
@@ -44,7 +44,7 @@
           <w:sz w:val="22"/>
           <w:szCs w:val="22"/>
         </w:rPr>
-        <w:t xml:space="preserve">16 ragazze, 4 stazioni da 4. Escluso riscaldamento e defaticamento: si parte già mobilizzate. Rotazione ogni 6 minuti, cambio stazione in circa 1 minuto.</w:t>
+        <w:t xml:space="preserve">16 ragazze, 4 stazioni da 4. Escluso riscaldamento e defaticamento: si parte già mobilizzate.</w:t>
       </w:r>
     </w:p>
     <w:p>
@@ -60,6 +60,473 @@
           <w:sz w:val="24"/>
           <w:szCs w:val="24"/>
         </w:rPr>
+        <w:t xml:space="preserve">Come funziona il tempo</w:t>
+      </w:r>
+    </w:p>
+    <w:tbl>
+      <w:tblPr>
+        <w:tblW w:type="dxa" w:w="10240"/>
+        <w:tblBorders>
+          <w:top w:val="single" w:color="auto" w:sz="4"/>
+          <w:left w:val="single" w:color="auto" w:sz="4"/>
+          <w:bottom w:val="single" w:color="auto" w:sz="4"/>
+          <w:right w:val="single" w:color="auto" w:sz="4"/>
+          <w:insideH w:val="single" w:color="auto" w:sz="4"/>
+          <w:insideV w:val="single" w:color="auto" w:sz="4"/>
+        </w:tblBorders>
+      </w:tblPr>
+      <w:tblGrid>
+        <w:gridCol w:w="2200"/>
+        <w:gridCol w:w="8040"/>
+      </w:tblGrid>
+      <w:tr>
+        <w:tc>
+          <w:tcPr>
+            <w:tcW w:type="dxa" w:w="2200"/>
+            <w:shd w:fill="E7E6E6" w:val="clear"/>
+            <w:tcMar>
+              <w:top w:type="dxa" w:w="60"/>
+              <w:left w:type="dxa" w:w="100"/>
+              <w:bottom w:type="dxa" w:w="60"/>
+              <w:right w:type="dxa" w:w="100"/>
+            </w:tcMar>
+          </w:tcPr>
+          <w:p>
+            <w:r>
+              <w:rPr>
+                <w:rFonts w:ascii="Calibri" w:cs="Calibri" w:eastAsia="Calibri" w:hAnsi="Calibri"/>
+                <w:b/>
+                <w:bCs/>
+                <w:sz w:val="22"/>
+                <w:szCs w:val="22"/>
+              </w:rPr>
+              <w:t xml:space="preserve">Tempo</w:t>
+            </w:r>
+          </w:p>
+        </w:tc>
+        <w:tc>
+          <w:tcPr>
+            <w:tcW w:type="dxa" w:w="8040"/>
+            <w:shd w:fill="E7E6E6" w:val="clear"/>
+            <w:tcMar>
+              <w:top w:type="dxa" w:w="60"/>
+              <w:left w:type="dxa" w:w="100"/>
+              <w:bottom w:type="dxa" w:w="60"/>
+              <w:right w:type="dxa" w:w="100"/>
+            </w:tcMar>
+          </w:tcPr>
+          <w:p>
+            <w:r>
+              <w:rPr>
+                <w:rFonts w:ascii="Calibri" w:cs="Calibri" w:eastAsia="Calibri" w:hAnsi="Calibri"/>
+                <w:b/>
+                <w:bCs/>
+                <w:sz w:val="22"/>
+                <w:szCs w:val="22"/>
+              </w:rPr>
+              <w:t xml:space="preserve">Cosa succede</w:t>
+            </w:r>
+          </w:p>
+        </w:tc>
+      </w:tr>
+      <w:tr>
+        <w:tc>
+          <w:tcPr>
+            <w:tcW w:type="dxa" w:w="2200"/>
+            <w:tcMar>
+              <w:top w:type="dxa" w:w="60"/>
+              <w:left w:type="dxa" w:w="100"/>
+              <w:bottom w:type="dxa" w:w="60"/>
+              <w:right w:type="dxa" w:w="100"/>
+            </w:tcMar>
+          </w:tcPr>
+          <w:p>
+            <w:r>
+              <w:rPr>
+                <w:rFonts w:ascii="Calibri" w:cs="Calibri" w:eastAsia="Calibri" w:hAnsi="Calibri"/>
+                <w:b w:val="false"/>
+                <w:bCs w:val="false"/>
+                <w:sz w:val="22"/>
+                <w:szCs w:val="22"/>
+              </w:rPr>
+              <w:t xml:space="preserve">0′–3′</w:t>
+            </w:r>
+          </w:p>
+        </w:tc>
+        <w:tc>
+          <w:tcPr>
+            <w:tcW w:type="dxa" w:w="8040"/>
+            <w:tcMar>
+              <w:top w:type="dxa" w:w="60"/>
+              <w:left w:type="dxa" w:w="100"/>
+              <w:bottom w:type="dxa" w:w="60"/>
+              <w:right w:type="dxa" w:w="100"/>
+            </w:tcMar>
+          </w:tcPr>
+          <w:p>
+            <w:r>
+              <w:rPr>
+                <w:rFonts w:ascii="Calibri" w:cs="Calibri" w:eastAsia="Calibri" w:hAnsi="Calibri"/>
+                <w:b w:val="false"/>
+                <w:bCs w:val="false"/>
+                <w:sz w:val="22"/>
+                <w:szCs w:val="22"/>
+              </w:rPr>
+              <w:t xml:space="preserve">Spiegazione e disposizione: 4 gruppi da 4, uno per stazione.</w:t>
+            </w:r>
+          </w:p>
+        </w:tc>
+      </w:tr>
+      <w:tr>
+        <w:tc>
+          <w:tcPr>
+            <w:tcW w:type="dxa" w:w="2200"/>
+            <w:tcMar>
+              <w:top w:type="dxa" w:w="60"/>
+              <w:left w:type="dxa" w:w="100"/>
+              <w:bottom w:type="dxa" w:w="60"/>
+              <w:right w:type="dxa" w:w="100"/>
+            </w:tcMar>
+          </w:tcPr>
+          <w:p>
+            <w:r>
+              <w:rPr>
+                <w:rFonts w:ascii="Calibri" w:cs="Calibri" w:eastAsia="Calibri" w:hAnsi="Calibri"/>
+                <w:b w:val="false"/>
+                <w:bCs w:val="false"/>
+                <w:sz w:val="22"/>
+                <w:szCs w:val="22"/>
+              </w:rPr>
+              <w:t xml:space="preserve">3′–9′</w:t>
+            </w:r>
+          </w:p>
+        </w:tc>
+        <w:tc>
+          <w:tcPr>
+            <w:tcW w:type="dxa" w:w="8040"/>
+            <w:tcMar>
+              <w:top w:type="dxa" w:w="60"/>
+              <w:left w:type="dxa" w:w="100"/>
+              <w:bottom w:type="dxa" w:w="60"/>
+              <w:right w:type="dxa" w:w="100"/>
+            </w:tcMar>
+          </w:tcPr>
+          <w:p>
+            <w:r>
+              <w:rPr>
+                <w:rFonts w:ascii="Calibri" w:cs="Calibri" w:eastAsia="Calibri" w:hAnsi="Calibri"/>
+                <w:b w:val="false"/>
+                <w:bCs w:val="false"/>
+                <w:sz w:val="22"/>
+                <w:szCs w:val="22"/>
+              </w:rPr>
+              <w:t xml:space="preserve">Giro 1 — 6′ di lavoro in ogni stazione.</w:t>
+            </w:r>
+          </w:p>
+        </w:tc>
+      </w:tr>
+      <w:tr>
+        <w:tc>
+          <w:tcPr>
+            <w:tcW w:type="dxa" w:w="2200"/>
+            <w:tcMar>
+              <w:top w:type="dxa" w:w="60"/>
+              <w:left w:type="dxa" w:w="100"/>
+              <w:bottom w:type="dxa" w:w="60"/>
+              <w:right w:type="dxa" w:w="100"/>
+            </w:tcMar>
+          </w:tcPr>
+          <w:p>
+            <w:r>
+              <w:rPr>
+                <w:rFonts w:ascii="Calibri" w:cs="Calibri" w:eastAsia="Calibri" w:hAnsi="Calibri"/>
+                <w:b w:val="false"/>
+                <w:bCs w:val="false"/>
+                <w:sz w:val="22"/>
+                <w:szCs w:val="22"/>
+              </w:rPr>
+              <w:t xml:space="preserve">9′–10′</w:t>
+            </w:r>
+          </w:p>
+        </w:tc>
+        <w:tc>
+          <w:tcPr>
+            <w:tcW w:type="dxa" w:w="8040"/>
+            <w:tcMar>
+              <w:top w:type="dxa" w:w="60"/>
+              <w:left w:type="dxa" w:w="100"/>
+              <w:bottom w:type="dxa" w:w="60"/>
+              <w:right w:type="dxa" w:w="100"/>
+            </w:tcMar>
+          </w:tcPr>
+          <w:p>
+            <w:r>
+              <w:rPr>
+                <w:rFonts w:ascii="Calibri" w:cs="Calibri" w:eastAsia="Calibri" w:hAnsi="Calibri"/>
+                <w:b w:val="false"/>
+                <w:bCs w:val="false"/>
+                <w:sz w:val="22"/>
+                <w:szCs w:val="22"/>
+              </w:rPr>
+              <w:t xml:space="preserve">Cambio stazione (rotazione di tutti i gruppi).</w:t>
+            </w:r>
+          </w:p>
+        </w:tc>
+      </w:tr>
+      <w:tr>
+        <w:tc>
+          <w:tcPr>
+            <w:tcW w:type="dxa" w:w="2200"/>
+            <w:tcMar>
+              <w:top w:type="dxa" w:w="60"/>
+              <w:left w:type="dxa" w:w="100"/>
+              <w:bottom w:type="dxa" w:w="60"/>
+              <w:right w:type="dxa" w:w="100"/>
+            </w:tcMar>
+          </w:tcPr>
+          <w:p>
+            <w:r>
+              <w:rPr>
+                <w:rFonts w:ascii="Calibri" w:cs="Calibri" w:eastAsia="Calibri" w:hAnsi="Calibri"/>
+                <w:b w:val="false"/>
+                <w:bCs w:val="false"/>
+                <w:sz w:val="22"/>
+                <w:szCs w:val="22"/>
+              </w:rPr>
+              <w:t xml:space="preserve">10′–16′</w:t>
+            </w:r>
+          </w:p>
+        </w:tc>
+        <w:tc>
+          <w:tcPr>
+            <w:tcW w:type="dxa" w:w="8040"/>
+            <w:tcMar>
+              <w:top w:type="dxa" w:w="60"/>
+              <w:left w:type="dxa" w:w="100"/>
+              <w:bottom w:type="dxa" w:w="60"/>
+              <w:right w:type="dxa" w:w="100"/>
+            </w:tcMar>
+          </w:tcPr>
+          <w:p>
+            <w:r>
+              <w:rPr>
+                <w:rFonts w:ascii="Calibri" w:cs="Calibri" w:eastAsia="Calibri" w:hAnsi="Calibri"/>
+                <w:b w:val="false"/>
+                <w:bCs w:val="false"/>
+                <w:sz w:val="22"/>
+                <w:szCs w:val="22"/>
+              </w:rPr>
+              <w:t xml:space="preserve">Giro 2 — 6′ di lavoro.</w:t>
+            </w:r>
+          </w:p>
+        </w:tc>
+      </w:tr>
+      <w:tr>
+        <w:tc>
+          <w:tcPr>
+            <w:tcW w:type="dxa" w:w="2200"/>
+            <w:tcMar>
+              <w:top w:type="dxa" w:w="60"/>
+              <w:left w:type="dxa" w:w="100"/>
+              <w:bottom w:type="dxa" w:w="60"/>
+              <w:right w:type="dxa" w:w="100"/>
+            </w:tcMar>
+          </w:tcPr>
+          <w:p>
+            <w:r>
+              <w:rPr>
+                <w:rFonts w:ascii="Calibri" w:cs="Calibri" w:eastAsia="Calibri" w:hAnsi="Calibri"/>
+                <w:b w:val="false"/>
+                <w:bCs w:val="false"/>
+                <w:sz w:val="22"/>
+                <w:szCs w:val="22"/>
+              </w:rPr>
+              <w:t xml:space="preserve">16′–17′</w:t>
+            </w:r>
+          </w:p>
+        </w:tc>
+        <w:tc>
+          <w:tcPr>
+            <w:tcW w:type="dxa" w:w="8040"/>
+            <w:tcMar>
+              <w:top w:type="dxa" w:w="60"/>
+              <w:left w:type="dxa" w:w="100"/>
+              <w:bottom w:type="dxa" w:w="60"/>
+              <w:right w:type="dxa" w:w="100"/>
+            </w:tcMar>
+          </w:tcPr>
+          <w:p>
+            <w:r>
+              <w:rPr>
+                <w:rFonts w:ascii="Calibri" w:cs="Calibri" w:eastAsia="Calibri" w:hAnsi="Calibri"/>
+                <w:b w:val="false"/>
+                <w:bCs w:val="false"/>
+                <w:sz w:val="22"/>
+                <w:szCs w:val="22"/>
+              </w:rPr>
+              <w:t xml:space="preserve">Cambio stazione.</w:t>
+            </w:r>
+          </w:p>
+        </w:tc>
+      </w:tr>
+      <w:tr>
+        <w:tc>
+          <w:tcPr>
+            <w:tcW w:type="dxa" w:w="2200"/>
+            <w:tcMar>
+              <w:top w:type="dxa" w:w="60"/>
+              <w:left w:type="dxa" w:w="100"/>
+              <w:bottom w:type="dxa" w:w="60"/>
+              <w:right w:type="dxa" w:w="100"/>
+            </w:tcMar>
+          </w:tcPr>
+          <w:p>
+            <w:r>
+              <w:rPr>
+                <w:rFonts w:ascii="Calibri" w:cs="Calibri" w:eastAsia="Calibri" w:hAnsi="Calibri"/>
+                <w:b w:val="false"/>
+                <w:bCs w:val="false"/>
+                <w:sz w:val="22"/>
+                <w:szCs w:val="22"/>
+              </w:rPr>
+              <w:t xml:space="preserve">17′–23′</w:t>
+            </w:r>
+          </w:p>
+        </w:tc>
+        <w:tc>
+          <w:tcPr>
+            <w:tcW w:type="dxa" w:w="8040"/>
+            <w:tcMar>
+              <w:top w:type="dxa" w:w="60"/>
+              <w:left w:type="dxa" w:w="100"/>
+              <w:bottom w:type="dxa" w:w="60"/>
+              <w:right w:type="dxa" w:w="100"/>
+            </w:tcMar>
+          </w:tcPr>
+          <w:p>
+            <w:r>
+              <w:rPr>
+                <w:rFonts w:ascii="Calibri" w:cs="Calibri" w:eastAsia="Calibri" w:hAnsi="Calibri"/>
+                <w:b w:val="false"/>
+                <w:bCs w:val="false"/>
+                <w:sz w:val="22"/>
+                <w:szCs w:val="22"/>
+              </w:rPr>
+              <w:t xml:space="preserve">Giro 3 — 6′ di lavoro.</w:t>
+            </w:r>
+          </w:p>
+        </w:tc>
+      </w:tr>
+      <w:tr>
+        <w:tc>
+          <w:tcPr>
+            <w:tcW w:type="dxa" w:w="2200"/>
+            <w:tcMar>
+              <w:top w:type="dxa" w:w="60"/>
+              <w:left w:type="dxa" w:w="100"/>
+              <w:bottom w:type="dxa" w:w="60"/>
+              <w:right w:type="dxa" w:w="100"/>
+            </w:tcMar>
+          </w:tcPr>
+          <w:p>
+            <w:r>
+              <w:rPr>
+                <w:rFonts w:ascii="Calibri" w:cs="Calibri" w:eastAsia="Calibri" w:hAnsi="Calibri"/>
+                <w:b w:val="false"/>
+                <w:bCs w:val="false"/>
+                <w:sz w:val="22"/>
+                <w:szCs w:val="22"/>
+              </w:rPr>
+              <w:t xml:space="preserve">23′–24′</w:t>
+            </w:r>
+          </w:p>
+        </w:tc>
+        <w:tc>
+          <w:tcPr>
+            <w:tcW w:type="dxa" w:w="8040"/>
+            <w:tcMar>
+              <w:top w:type="dxa" w:w="60"/>
+              <w:left w:type="dxa" w:w="100"/>
+              <w:bottom w:type="dxa" w:w="60"/>
+              <w:right w:type="dxa" w:w="100"/>
+            </w:tcMar>
+          </w:tcPr>
+          <w:p>
+            <w:r>
+              <w:rPr>
+                <w:rFonts w:ascii="Calibri" w:cs="Calibri" w:eastAsia="Calibri" w:hAnsi="Calibri"/>
+                <w:b w:val="false"/>
+                <w:bCs w:val="false"/>
+                <w:sz w:val="22"/>
+                <w:szCs w:val="22"/>
+              </w:rPr>
+              <w:t xml:space="preserve">Cambio stazione.</w:t>
+            </w:r>
+          </w:p>
+        </w:tc>
+      </w:tr>
+      <w:tr>
+        <w:tc>
+          <w:tcPr>
+            <w:tcW w:type="dxa" w:w="2200"/>
+            <w:tcMar>
+              <w:top w:type="dxa" w:w="60"/>
+              <w:left w:type="dxa" w:w="100"/>
+              <w:bottom w:type="dxa" w:w="60"/>
+              <w:right w:type="dxa" w:w="100"/>
+            </w:tcMar>
+          </w:tcPr>
+          <w:p>
+            <w:r>
+              <w:rPr>
+                <w:rFonts w:ascii="Calibri" w:cs="Calibri" w:eastAsia="Calibri" w:hAnsi="Calibri"/>
+                <w:b w:val="false"/>
+                <w:bCs w:val="false"/>
+                <w:sz w:val="22"/>
+                <w:szCs w:val="22"/>
+              </w:rPr>
+              <w:t xml:space="preserve">24′–30′</w:t>
+            </w:r>
+          </w:p>
+        </w:tc>
+        <w:tc>
+          <w:tcPr>
+            <w:tcW w:type="dxa" w:w="8040"/>
+            <w:tcMar>
+              <w:top w:type="dxa" w:w="60"/>
+              <w:left w:type="dxa" w:w="100"/>
+              <w:bottom w:type="dxa" w:w="60"/>
+              <w:right w:type="dxa" w:w="100"/>
+            </w:tcMar>
+          </w:tcPr>
+          <w:p>
+            <w:r>
+              <w:rPr>
+                <w:rFonts w:ascii="Calibri" w:cs="Calibri" w:eastAsia="Calibri" w:hAnsi="Calibri"/>
+                <w:b w:val="false"/>
+                <w:bCs w:val="false"/>
+                <w:sz w:val="22"/>
+                <w:szCs w:val="22"/>
+              </w:rPr>
+              <w:t xml:space="preserve">Giro 4 — 6′ di lavoro. Ogni gruppo ha fatto tutte e 4 le stazioni.</w:t>
+            </w:r>
+          </w:p>
+        </w:tc>
+      </w:tr>
+    </w:tbl>
+    <w:p>
+      <w:pPr>
+        <w:pStyle w:val="Heading3"/>
+        <w:spacing w:after="100" w:before="240"/>
+      </w:pPr>
+      <w:r>
+        <w:rPr>
+          <w:rFonts w:ascii="Calibri" w:cs="Calibri" w:eastAsia="Calibri" w:hAnsi="Calibri"/>
+          <w:b/>
+          <w:bCs/>
+          <w:sz w:val="24"/>
+          <w:szCs w:val="24"/>
+        </w:rPr>
         <w:t xml:space="preserve">Stazione 1 — Bilanciere — 6 minuti</w:t>
       </w:r>
     </w:p>
@@ -73,7 +540,7 @@
           <w:sz w:val="22"/>
           <w:szCs w:val="22"/>
         </w:rPr>
-        <w:t xml:space="preserve">Due bilancieri, a coppie: mentre una fa squat, l'altra fa stacco sull'altro. Cambio a metà tempo.</w:t>
+        <w:t xml:space="preserve">Un solo castello: le 4 della stazione si dividono in 2+2. Primi 3′: gruppo A al castello fa squat, gruppo B fa stacco con bilanciere a terra (senza castello). Ultimi 3′: si scambiano.</w:t>
       </w:r>
     </w:p>
     <w:p>
@@ -91,7 +558,7 @@
           <w:sz w:val="22"/>
           <w:szCs w:val="22"/>
         </w:rPr>
-        <w:t xml:space="preserve">Squat con bilanciere — 3 × 6 (chi non ha i requisiti: manubrio davanti al petto)</w:t>
+        <w:t xml:space="preserve">Squat con bilanciere (al castello) — 3 × 6 a testa, a turni con la compagna di gruppo (chi non ha i requisiti: manubrio davanti al petto)</w:t>
       </w:r>
     </w:p>
     <w:p>
@@ -109,7 +576,7 @@
           <w:sz w:val="22"/>
           <w:szCs w:val="22"/>
         </w:rPr>
-        <w:t xml:space="preserve">Stacco rumeno con bilanciere — 3 × 6, bilanciere a contatto con le gambe in discesa</w:t>
+        <w:t xml:space="preserve">Stacco rumeno con bilanciere (a terra, senza castello) — 3 × 6 a testa, a turni con la compagna di gruppo</w:t>
       </w:r>
     </w:p>
     <w:p>
@@ -335,7 +802,7 @@
           <w:sz w:val="24"/>
           <w:szCs w:val="24"/>
         </w:rPr>
-        <w:t xml:space="preserve">Timing e cambio</w:t>
+        <w:t xml:space="preserve">Dopo — palla</w:t>
       </w:r>
     </w:p>
     <w:p>
@@ -348,36 +815,7 @@
           <w:sz w:val="22"/>
           <w:szCs w:val="22"/>
         </w:rPr>
-        <w:t xml:space="preserve">3′ organizzazione gruppi e spiegazione + 4 giri da 6′ + 3 cambi da 1′ = 30′ totali.</w:t>
-      </w:r>
-    </w:p>
-    <w:p>
-      <w:pPr>
-        <w:pStyle w:val="Heading3"/>
-        <w:spacing w:after="100" w:before="240"/>
-      </w:pPr>
-      <w:r>
-        <w:rPr>
-          <w:rFonts w:ascii="Calibri" w:cs="Calibri" w:eastAsia="Calibri" w:hAnsi="Calibri"/>
-          <w:b/>
-          <w:bCs/>
-          <w:sz w:val="24"/>
-          <w:szCs w:val="24"/>
-        </w:rPr>
-        <w:t xml:space="preserve">Dopo — palla</w:t>
-      </w:r>
-    </w:p>
-    <w:p>
-      <w:pPr>
-        <w:spacing w:after="100"/>
-      </w:pPr>
-      <w:r>
-        <w:rPr>
-          <w:rFonts w:ascii="Calibri" w:cs="Calibri" w:eastAsia="Calibri" w:hAnsi="Calibri"/>
-          <w:sz w:val="22"/>
-          <w:szCs w:val="22"/>
-        </w:rPr>
-        <w:t xml:space="preserve">Al termine del quarto giro, senza pausa: si passa subito alla palla.</w:t>
+        <w:t xml:space="preserve">Al termine del giro 4, senza pausa: si passa subito alla palla.</w:t>
       </w:r>
     </w:p>
     <w:sectPr>

</xml_diff>

<commit_message>
Aggiunge la divisione dei minuti tra gli esercizi dentro ogni stazione
Ogni stazione con più esercizi ora indica i minuti esatti per ciascuno
(0'-2', 2'-4', 4'-6'), invece di lasciare solo l'elenco senza scansione.

Co-Authored-By: Claude Sonnet 5 <noreply@anthropic.com>
Claude-Session: https://claude.ai/code/session_01A8B3XEGiQEzbQL2hnkViua
</commit_message>
<xml_diff>
--- a/serie-d/Serie D - Forza a stazioni - 30 minuti.docx
+++ b/serie-d/Serie D - Forza a stazioni - 30 minuti.docx
@@ -540,7 +540,7 @@
           <w:sz w:val="22"/>
           <w:szCs w:val="22"/>
         </w:rPr>
-        <w:t xml:space="preserve">Un solo castello: le 4 della stazione si dividono in 2+2. Primi 3′: gruppo A al castello fa squat, gruppo B fa stacco con bilanciere a terra (senza castello). Ultimi 3′: si scambiano.</w:t>
+        <w:t xml:space="preserve">Un solo castello: le 4 della stazione si dividono in 2+2 (gruppo A e gruppo B).</w:t>
       </w:r>
     </w:p>
     <w:p>
@@ -558,7 +558,7 @@
           <w:sz w:val="22"/>
           <w:szCs w:val="22"/>
         </w:rPr>
-        <w:t xml:space="preserve">Squat con bilanciere (al castello) — 3 × 6 a testa, a turni con la compagna di gruppo (chi non ha i requisiti: manubrio davanti al petto)</w:t>
+        <w:t xml:space="preserve">0′–3′ — Gruppo A al castello: squat con bilanciere — 3 × 6 a testa, a turni con la compagna (chi non ha i requisiti: manubrio davanti al petto). Gruppo B a terra: stacco rumeno con bilanciere — 3 × 6 a testa, a turni con la compagna</w:t>
       </w:r>
     </w:p>
     <w:p>
@@ -576,7 +576,7 @@
           <w:sz w:val="22"/>
           <w:szCs w:val="22"/>
         </w:rPr>
-        <w:t xml:space="preserve">Stacco rumeno con bilanciere (a terra, senza castello) — 3 × 6 a testa, a turni con la compagna di gruppo</w:t>
+        <w:t xml:space="preserve">3′–6′ — Si scambiano: gruppo B al castello, gruppo A a terra, stessi esercizi</w:t>
       </w:r>
     </w:p>
     <w:p>
@@ -593,6 +593,19 @@
           <w:szCs w:val="24"/>
         </w:rPr>
         <w:t xml:space="preserve">Stazione 2 — Anca e ginocchio — 6 minuti</w:t>
+      </w:r>
+    </w:p>
+    <w:p>
+      <w:pPr>
+        <w:spacing w:after="100"/>
+      </w:pPr>
+      <w:r>
+        <w:rPr>
+          <w:rFonts w:ascii="Calibri" w:cs="Calibri" w:eastAsia="Calibri" w:hAnsi="Calibri"/>
+          <w:sz w:val="22"/>
+          <w:szCs w:val="22"/>
+        </w:rPr>
+        <w:t xml:space="preserve">Sequenza: 2′ per esercizio, tutte e 4 insieme, si cambia esercizio ogni 2′ (fischio o cronometro a vista).</w:t>
       </w:r>
     </w:p>
     <w:p>
@@ -610,7 +623,7 @@
           <w:sz w:val="22"/>
           <w:szCs w:val="22"/>
         </w:rPr>
-        <w:t xml:space="preserve">Copenhagen, ginocchio sulla panca — 3 × 8 per lato</w:t>
+        <w:t xml:space="preserve">0′–2′ — Copenhagen, ginocchio sulla panca — 3 × 8 per lato</w:t>
       </w:r>
     </w:p>
     <w:p>
@@ -628,7 +641,7 @@
           <w:sz w:val="22"/>
           <w:szCs w:val="22"/>
         </w:rPr>
-        <w:t xml:space="preserve">Abduzioni in decubito laterale con elastico — 3 × 12 per lato</w:t>
+        <w:t xml:space="preserve">2′–4′ — Abduzioni in decubito laterale con elastico — 3 × 12 per lato</w:t>
       </w:r>
     </w:p>
     <w:p>
@@ -646,7 +659,7 @@
           <w:sz w:val="22"/>
           <w:szCs w:val="22"/>
         </w:rPr>
-        <w:t xml:space="preserve">Ponte monopodalico — 2 × 10 per lato</w:t>
+        <w:t xml:space="preserve">4′–6′ — Ponte monopodalico — 2 × 10 per lato</w:t>
       </w:r>
     </w:p>
     <w:p>
@@ -663,6 +676,19 @@
           <w:szCs w:val="24"/>
         </w:rPr>
         <w:t xml:space="preserve">Stazione 3 — Core — 6 minuti</w:t>
+      </w:r>
+    </w:p>
+    <w:p>
+      <w:pPr>
+        <w:spacing w:after="100"/>
+      </w:pPr>
+      <w:r>
+        <w:rPr>
+          <w:rFonts w:ascii="Calibri" w:cs="Calibri" w:eastAsia="Calibri" w:hAnsi="Calibri"/>
+          <w:sz w:val="22"/>
+          <w:szCs w:val="22"/>
+        </w:rPr>
+        <w:t xml:space="preserve">Sequenza: 2′ per esercizio, tutte e 4 insieme, si cambia esercizio ogni 2′.</w:t>
       </w:r>
     </w:p>
     <w:p>
@@ -680,7 +706,7 @@
           <w:sz w:val="22"/>
           <w:szCs w:val="22"/>
         </w:rPr>
-        <w:t xml:space="preserve">Plank con tocco spalla alternato — 3 × 10 per lato</w:t>
+        <w:t xml:space="preserve">0′–2′ — Plank con tocco spalla alternato — 3 × 10 per lato</w:t>
       </w:r>
     </w:p>
     <w:p>
@@ -698,7 +724,7 @@
           <w:sz w:val="22"/>
           <w:szCs w:val="22"/>
         </w:rPr>
-        <w:t xml:space="preserve">Pallof press con elastico — 2 × 10 per lato</w:t>
+        <w:t xml:space="preserve">2′–4′ — Pallof press con elastico — 2 × 10 per lato</w:t>
       </w:r>
     </w:p>
     <w:p>
@@ -716,7 +742,7 @@
           <w:sz w:val="22"/>
           <w:szCs w:val="22"/>
         </w:rPr>
-        <w:t xml:space="preserve">Dead bug — 2 × 12</w:t>
+        <w:t xml:space="preserve">4′–6′ — Dead bug — 2 × 12</w:t>
       </w:r>
     </w:p>
     <w:p>
@@ -733,6 +759,19 @@
           <w:szCs w:val="24"/>
         </w:rPr>
         <w:t xml:space="preserve">Stazione 4 — Tronco superiore — 6 minuti</w:t>
+      </w:r>
+    </w:p>
+    <w:p>
+      <w:pPr>
+        <w:spacing w:after="100"/>
+      </w:pPr>
+      <w:r>
+        <w:rPr>
+          <w:rFonts w:ascii="Calibri" w:cs="Calibri" w:eastAsia="Calibri" w:hAnsi="Calibri"/>
+          <w:sz w:val="22"/>
+          <w:szCs w:val="22"/>
+        </w:rPr>
+        <w:t xml:space="preserve">Sequenza: 2′ per esercizio, tutte e 4 insieme, si cambia esercizio ogni 2′. Se avete solo 1-2 palle mediche: negli ultimi 2′ a coppie a turno, chi aspetta tiene plank.</w:t>
       </w:r>
     </w:p>
     <w:p>
@@ -750,7 +789,7 @@
           <w:sz w:val="22"/>
           <w:szCs w:val="22"/>
         </w:rPr>
-        <w:t xml:space="preserve">Piegamenti (chi non ha i requisiti: piegamenti sulle ginocchia) — 3 × 10</w:t>
+        <w:t xml:space="preserve">0′–2′ — Piegamenti (chi non ha i requisiti: piegamenti sulle ginocchia) — 3 × 10</w:t>
       </w:r>
     </w:p>
     <w:p>
@@ -768,7 +807,7 @@
           <w:sz w:val="22"/>
           <w:szCs w:val="22"/>
         </w:rPr>
-        <w:t xml:space="preserve">Rematore con elastico — 3 × 10 per lato</w:t>
+        <w:t xml:space="preserve">2′–4′ — Rematore con elastico — 3 × 10 per lato</w:t>
       </w:r>
     </w:p>
     <w:p>
@@ -786,7 +825,7 @@
           <w:sz w:val="22"/>
           <w:szCs w:val="22"/>
         </w:rPr>
-        <w:t xml:space="preserve">Lancio al muro con palla medica, torsione del busto — 2 × 10 per lato</w:t>
+        <w:t xml:space="preserve">4′–6′ — Lancio al muro con palla medica, torsione del busto — 2 × 10 per lato</w:t>
       </w:r>
     </w:p>
     <w:p>

</xml_diff>

<commit_message>
Rimuove tutti gli esercizi con elastico, sostituiti con manubri/corpo libero
Niente elastici a disposizione: abduzioni ora a corpo libero, Pallof
press sostituito da woodchopper con manubrio, rematore con elastico
sostituito da rematore con manubrio.

Co-Authored-By: Claude Sonnet 5 <noreply@anthropic.com>
Claude-Session: https://claude.ai/code/session_01A8B3XEGiQEzbQL2hnkViua
</commit_message>
<xml_diff>
--- a/serie-d/Serie D - Forza a stazioni - 30 minuti.docx
+++ b/serie-d/Serie D - Forza a stazioni - 30 minuti.docx
@@ -641,7 +641,7 @@
           <w:sz w:val="22"/>
           <w:szCs w:val="22"/>
         </w:rPr>
-        <w:t xml:space="preserve">2′–4′ — Abduzioni in decubito laterale con elastico — 3 × 12 per lato</w:t>
+        <w:t xml:space="preserve">2′–4′ — Abduzioni in decubito laterale a corpo libero — 3 × 15 per lato</w:t>
       </w:r>
     </w:p>
     <w:p>
@@ -724,7 +724,7 @@
           <w:sz w:val="22"/>
           <w:szCs w:val="22"/>
         </w:rPr>
-        <w:t xml:space="preserve">2′–4′ — Pallof press con elastico — 2 × 10 per lato</w:t>
+        <w:t xml:space="preserve">2′–4′ — Woodchopper con manubrio, in piedi, diagonale — 2 × 10 per lato</w:t>
       </w:r>
     </w:p>
     <w:p>
@@ -807,7 +807,7 @@
           <w:sz w:val="22"/>
           <w:szCs w:val="22"/>
         </w:rPr>
-        <w:t xml:space="preserve">2′–4′ — Rematore con elastico — 3 × 10 per lato</w:t>
+        <w:t xml:space="preserve">2′–4′ — Rematore con manubrio, busto flesso in appoggio — 3 × 10 per lato</w:t>
       </w:r>
     </w:p>
     <w:p>

</xml_diff>